<commit_message>
audit théologique tafakkur : 1 correction critique + Q1
- Fix bug \n\n littéraux sur 18 questions (Q162-Q179, série 99 noms d'Allah)
- Q1 : reformulation ouverture module (suppression rhétorique négative)
- Régénération tafakkur_questions.docx miroir

Co-Authored-By: Claude Opus 4.6 (1M context) <noreply@anthropic.com>
</commit_message>
<xml_diff>
--- a/ECRITS_NIYYAH/tafakkur_questions.docx
+++ b/ECRITS_NIYYAH/tafakkur_questions.docx
@@ -43,7 +43,7 @@
           <w:sz w:val="22"/>
           <w:szCs w:val="22"/>
         </w:rPr>
-        <w:t xml:space="preserve">Tu crois qu’Allâh est en colère contre toi ? Sa miséricorde précède Sa colère. C’est un hadith authentique. C’est inscrit avant tout. Tu n’es pas l’exception.</w:t>
+        <w:t xml:space="preserve">Sa miséricorde précède Sa colère. C’est un hadith authentique. C’est inscrit avant tout. Quand tu doutes d’être aimé d’Allâh — souviens-toi : tu n’es pas l’exception.</w:t>
       </w:r>
     </w:p>
     <w:p>
@@ -8415,7 +8415,20 @@
           <w:sz w:val="22"/>
           <w:szCs w:val="22"/>
         </w:rPr>
-        <w:t xml:space="preserve">Qui a déjà fait pleuvoir sur des terres où personne ne priait ?\n\nAr-Rahmān — Le Tout-Miséricordieux</w:t>
+        <w:t xml:space="preserve">Qui a déjà fait pleuvoir sur des terres où personne ne priait ?</w:t>
+      </w:r>
+    </w:p>
+    <w:p>
+      <w:pPr>
+        <w:spacing w:after="60"/>
+      </w:pPr>
+      <w:r>
+        <w:rPr>
+          <w:rFonts w:ascii="Cormorant Garamond" w:cs="Cormorant Garamond" w:eastAsia="Cormorant Garamond" w:hAnsi="Cormorant Garamond"/>
+          <w:sz w:val="22"/>
+          <w:szCs w:val="22"/>
+        </w:rPr>
+        <w:t xml:space="preserve">Ar-Rahmān — Le Tout-Miséricordieux</w:t>
       </w:r>
     </w:p>
     <w:p>
@@ -8467,7 +8480,20 @@
           <w:sz w:val="22"/>
           <w:szCs w:val="22"/>
         </w:rPr>
-        <w:t xml:space="preserve">Qui veille pendant que tu dors sans serrure ?\n\nAl-Mu'min — La Sauvegarde</w:t>
+        <w:t xml:space="preserve">Qui veille pendant que tu dors sans serrure ?</w:t>
+      </w:r>
+    </w:p>
+    <w:p>
+      <w:pPr>
+        <w:spacing w:after="60"/>
+      </w:pPr>
+      <w:r>
+        <w:rPr>
+          <w:rFonts w:ascii="Cormorant Garamond" w:cs="Cormorant Garamond" w:eastAsia="Cormorant Garamond" w:hAnsi="Cormorant Garamond"/>
+          <w:sz w:val="22"/>
+          <w:szCs w:val="22"/>
+        </w:rPr>
+        <w:t xml:space="preserve">Al-Mu'min — La Sauvegarde</w:t>
       </w:r>
     </w:p>
     <w:p>
@@ -8519,7 +8545,20 @@
           <w:sz w:val="22"/>
           <w:szCs w:val="22"/>
         </w:rPr>
-        <w:t xml:space="preserve">Tout glisse, tout passe — qui retient ce qui ne doit pas tomber ?\n\nAl-Muhaymin — Le Préservateur</w:t>
+        <w:t xml:space="preserve">Tout glisse, tout passe — qui retient ce qui ne doit pas tomber ?</w:t>
+      </w:r>
+    </w:p>
+    <w:p>
+      <w:pPr>
+        <w:spacing w:after="60"/>
+      </w:pPr>
+      <w:r>
+        <w:rPr>
+          <w:rFonts w:ascii="Cormorant Garamond" w:cs="Cormorant Garamond" w:eastAsia="Cormorant Garamond" w:hAnsi="Cormorant Garamond"/>
+          <w:sz w:val="22"/>
+          <w:szCs w:val="22"/>
+        </w:rPr>
+        <w:t xml:space="preserve">Al-Muhaymin — Le Préservateur</w:t>
       </w:r>
     </w:p>
     <w:p>
@@ -8571,7 +8610,20 @@
           <w:sz w:val="22"/>
           <w:szCs w:val="22"/>
         </w:rPr>
-        <w:t xml:space="preserve">Une fracture invisible en toi — qui l'a remise en place sans que tu saches ?\n\nAl-Jabbār — Celui qui répare</w:t>
+        <w:t xml:space="preserve">Une fracture invisible en toi — qui l'a remise en place sans que tu saches ?</w:t>
+      </w:r>
+    </w:p>
+    <w:p>
+      <w:pPr>
+        <w:spacing w:after="60"/>
+      </w:pPr>
+      <w:r>
+        <w:rPr>
+          <w:rFonts w:ascii="Cormorant Garamond" w:cs="Cormorant Garamond" w:eastAsia="Cormorant Garamond" w:hAnsi="Cormorant Garamond"/>
+          <w:sz w:val="22"/>
+          <w:szCs w:val="22"/>
+        </w:rPr>
+        <w:t xml:space="preserve">Al-Jabbār — Celui qui répare</w:t>
       </w:r>
     </w:p>
     <w:p>
@@ -8623,7 +8675,20 @@
           <w:sz w:val="22"/>
           <w:szCs w:val="22"/>
         </w:rPr>
-        <w:t xml:space="preserve">Avant ta naissance, qui t'a pensé ?\n\nAl-Khāliq — Le Créateur</w:t>
+        <w:t xml:space="preserve">Avant ta naissance, qui t'a pensé ?</w:t>
+      </w:r>
+    </w:p>
+    <w:p>
+      <w:pPr>
+        <w:spacing w:after="60"/>
+      </w:pPr>
+      <w:r>
+        <w:rPr>
+          <w:rFonts w:ascii="Cormorant Garamond" w:cs="Cormorant Garamond" w:eastAsia="Cormorant Garamond" w:hAnsi="Cormorant Garamond"/>
+          <w:sz w:val="22"/>
+          <w:szCs w:val="22"/>
+        </w:rPr>
+        <w:t xml:space="preserve">Al-Khāliq — Le Créateur</w:t>
       </w:r>
     </w:p>
     <w:p>
@@ -8675,7 +8740,20 @@
           <w:sz w:val="22"/>
           <w:szCs w:val="22"/>
         </w:rPr>
-        <w:t xml:space="preserve">Avant que tu sois — il n'y avait rien de toi. Maintenant tu es. Comment ?\n\nAl-Bāri' — Celui qui fait exister du néant</w:t>
+        <w:t xml:space="preserve">Avant que tu sois — il n'y avait rien de toi. Maintenant tu es. Comment ?</w:t>
+      </w:r>
+    </w:p>
+    <w:p>
+      <w:pPr>
+        <w:spacing w:after="60"/>
+      </w:pPr>
+      <w:r>
+        <w:rPr>
+          <w:rFonts w:ascii="Cormorant Garamond" w:cs="Cormorant Garamond" w:eastAsia="Cormorant Garamond" w:hAnsi="Cormorant Garamond"/>
+          <w:sz w:val="22"/>
+          <w:szCs w:val="22"/>
+        </w:rPr>
+        <w:t xml:space="preserve">Al-Bāri' — Celui qui fait exister du néant</w:t>
       </w:r>
     </w:p>
     <w:p>
@@ -8727,7 +8805,20 @@
           <w:sz w:val="22"/>
           <w:szCs w:val="22"/>
         </w:rPr>
-        <w:t xml:space="preserve">Ton visage est unique sur 8 milliards. Qui a tenu le pinceau ?\n\nAl-Musawwir — Celui qui façonne</w:t>
+        <w:t xml:space="preserve">Ton visage est unique sur 8 milliards. Qui a tenu le pinceau ?</w:t>
+      </w:r>
+    </w:p>
+    <w:p>
+      <w:pPr>
+        <w:spacing w:after="60"/>
+      </w:pPr>
+      <w:r>
+        <w:rPr>
+          <w:rFonts w:ascii="Cormorant Garamond" w:cs="Cormorant Garamond" w:eastAsia="Cormorant Garamond" w:hAnsi="Cormorant Garamond"/>
+          <w:sz w:val="22"/>
+          <w:szCs w:val="22"/>
+        </w:rPr>
+        <w:t xml:space="preserve">Al-Musawwir — Celui qui façonne</w:t>
       </w:r>
     </w:p>
     <w:p>
@@ -8779,7 +8870,20 @@
           <w:sz w:val="22"/>
           <w:szCs w:val="22"/>
         </w:rPr>
-        <w:t xml:space="preserve">Le souffle que tu prends à l'instant — qui te l'a tendu ?\n\nAl-Wahhāb — Le Donateur</w:t>
+        <w:t xml:space="preserve">Le souffle que tu prends à l'instant — qui te l'a tendu ?</w:t>
+      </w:r>
+    </w:p>
+    <w:p>
+      <w:pPr>
+        <w:spacing w:after="60"/>
+      </w:pPr>
+      <w:r>
+        <w:rPr>
+          <w:rFonts w:ascii="Cormorant Garamond" w:cs="Cormorant Garamond" w:eastAsia="Cormorant Garamond" w:hAnsi="Cormorant Garamond"/>
+          <w:sz w:val="22"/>
+          <w:szCs w:val="22"/>
+        </w:rPr>
+        <w:t xml:space="preserve">Al-Wahhāb — Le Donateur</w:t>
       </w:r>
     </w:p>
     <w:p>
@@ -8831,7 +8935,20 @@
           <w:sz w:val="22"/>
           <w:szCs w:val="22"/>
         </w:rPr>
-        <w:t xml:space="preserve">Qui entend la phrase que tu n'as jamais prononcée à voix haute ?\n\nAs-Samī' — L'Audient</w:t>
+        <w:t xml:space="preserve">Qui entend la phrase que tu n'as jamais prononcée à voix haute ?</w:t>
+      </w:r>
+    </w:p>
+    <w:p>
+      <w:pPr>
+        <w:spacing w:after="60"/>
+      </w:pPr>
+      <w:r>
+        <w:rPr>
+          <w:rFonts w:ascii="Cormorant Garamond" w:cs="Cormorant Garamond" w:eastAsia="Cormorant Garamond" w:hAnsi="Cormorant Garamond"/>
+          <w:sz w:val="22"/>
+          <w:szCs w:val="22"/>
+        </w:rPr>
+        <w:t xml:space="preserve">As-Samī' — L'Audient</w:t>
       </w:r>
     </w:p>
     <w:p>
@@ -8883,7 +9000,20 @@
           <w:sz w:val="22"/>
           <w:szCs w:val="22"/>
         </w:rPr>
-        <w:t xml:space="preserve">Tu caches ce que tu fais à minuit. Qui le voit comme à midi ?\n\nAl-Khabīr — Le Bien-Informé</w:t>
+        <w:t xml:space="preserve">Tu caches ce que tu fais à minuit. Qui le voit comme à midi ?</w:t>
+      </w:r>
+    </w:p>
+    <w:p>
+      <w:pPr>
+        <w:spacing w:after="60"/>
+      </w:pPr>
+      <w:r>
+        <w:rPr>
+          <w:rFonts w:ascii="Cormorant Garamond" w:cs="Cormorant Garamond" w:eastAsia="Cormorant Garamond" w:hAnsi="Cormorant Garamond"/>
+          <w:sz w:val="22"/>
+          <w:szCs w:val="22"/>
+        </w:rPr>
+        <w:t xml:space="preserve">Al-Khabīr — Le Bien-Informé</w:t>
       </w:r>
     </w:p>
     <w:p>
@@ -8935,7 +9065,20 @@
           <w:sz w:val="22"/>
           <w:szCs w:val="22"/>
         </w:rPr>
-        <w:t xml:space="preserve">Tu as connu un amour sans condition. D'où vient cette source en l'homme ?\n\nAl-Wadūd — Le Tout-Aimant</w:t>
+        <w:t xml:space="preserve">Tu as connu un amour sans condition. D'où vient cette source en l'homme ?</w:t>
+      </w:r>
+    </w:p>
+    <w:p>
+      <w:pPr>
+        <w:spacing w:after="60"/>
+      </w:pPr>
+      <w:r>
+        <w:rPr>
+          <w:rFonts w:ascii="Cormorant Garamond" w:cs="Cormorant Garamond" w:eastAsia="Cormorant Garamond" w:hAnsi="Cormorant Garamond"/>
+          <w:sz w:val="22"/>
+          <w:szCs w:val="22"/>
+        </w:rPr>
+        <w:t xml:space="preserve">Al-Wadūd — Le Tout-Aimant</w:t>
       </w:r>
     </w:p>
     <w:p>
@@ -8987,7 +9130,20 @@
           <w:sz w:val="22"/>
           <w:szCs w:val="22"/>
         </w:rPr>
-        <w:t xml:space="preserve">Une rencontre arrivée au bon moment — qui en a réglé l'horaire ?\n\nAl-Muqaddim — Celui qui avance</w:t>
+        <w:t xml:space="preserve">Une rencontre arrivée au bon moment — qui en a réglé l'horaire ?</w:t>
+      </w:r>
+    </w:p>
+    <w:p>
+      <w:pPr>
+        <w:spacing w:after="60"/>
+      </w:pPr>
+      <w:r>
+        <w:rPr>
+          <w:rFonts w:ascii="Cormorant Garamond" w:cs="Cormorant Garamond" w:eastAsia="Cormorant Garamond" w:hAnsi="Cormorant Garamond"/>
+          <w:sz w:val="22"/>
+          <w:szCs w:val="22"/>
+        </w:rPr>
+        <w:t xml:space="preserve">Al-Muqaddim — Celui qui avance</w:t>
       </w:r>
     </w:p>
     <w:p>
@@ -9039,7 +9195,20 @@
           <w:sz w:val="22"/>
           <w:szCs w:val="22"/>
         </w:rPr>
-        <w:t xml:space="preserve">Une bienveillance t'a touché sans que tu la mérites. Tu te souviens de qui ?\n\nAl-Barr — Le Bienveillant</w:t>
+        <w:t xml:space="preserve">Une bienveillance t'a touché sans que tu la mérites. Tu te souviens de qui ?</w:t>
+      </w:r>
+    </w:p>
+    <w:p>
+      <w:pPr>
+        <w:spacing w:after="60"/>
+      </w:pPr>
+      <w:r>
+        <w:rPr>
+          <w:rFonts w:ascii="Cormorant Garamond" w:cs="Cormorant Garamond" w:eastAsia="Cormorant Garamond" w:hAnsi="Cormorant Garamond"/>
+          <w:sz w:val="22"/>
+          <w:szCs w:val="22"/>
+        </w:rPr>
+        <w:t xml:space="preserve">Al-Barr — Le Bienveillant</w:t>
       </w:r>
     </w:p>
     <w:p>
@@ -9091,7 +9260,20 @@
           <w:sz w:val="22"/>
           <w:szCs w:val="22"/>
         </w:rPr>
-        <w:t xml:space="preserve">Tu as fauté. Tu te souviens. Lui efface. Pourquoi ?\n\nAl-'Afuww — L'Indulgent</w:t>
+        <w:t xml:space="preserve">Tu as fauté. Tu te souviens. Lui efface. Pourquoi ?</w:t>
+      </w:r>
+    </w:p>
+    <w:p>
+      <w:pPr>
+        <w:spacing w:after="60"/>
+      </w:pPr>
+      <w:r>
+        <w:rPr>
+          <w:rFonts w:ascii="Cormorant Garamond" w:cs="Cormorant Garamond" w:eastAsia="Cormorant Garamond" w:hAnsi="Cormorant Garamond"/>
+          <w:sz w:val="22"/>
+          <w:szCs w:val="22"/>
+        </w:rPr>
+        <w:t xml:space="preserve">Al-'Afuww — L'Indulgent</w:t>
       </w:r>
     </w:p>
     <w:p>
@@ -9143,7 +9325,20 @@
           <w:sz w:val="22"/>
           <w:szCs w:val="22"/>
         </w:rPr>
-        <w:t xml:space="preserve">Une suffisance t'est venue sans que tu aies tout calculé. Qui a déposé ?\n\nAl-Mughnī — Celui qui enrichit</w:t>
+        <w:t xml:space="preserve">Une suffisance t'est venue sans que tu aies tout calculé. Qui a déposé ?</w:t>
+      </w:r>
+    </w:p>
+    <w:p>
+      <w:pPr>
+        <w:spacing w:after="60"/>
+      </w:pPr>
+      <w:r>
+        <w:rPr>
+          <w:rFonts w:ascii="Cormorant Garamond" w:cs="Cormorant Garamond" w:eastAsia="Cormorant Garamond" w:hAnsi="Cormorant Garamond"/>
+          <w:sz w:val="22"/>
+          <w:szCs w:val="22"/>
+        </w:rPr>
+        <w:t xml:space="preserve">Al-Mughnī — Celui qui enrichit</w:t>
       </w:r>
     </w:p>
     <w:p>
@@ -9195,7 +9390,20 @@
           <w:sz w:val="22"/>
           <w:szCs w:val="22"/>
         </w:rPr>
-        <w:t xml:space="preserve">Tu as trouvé un chemin que tu n'avais pas cherché. Qui marchait devant ?\n\nAl-Hādī — Le Guide</w:t>
+        <w:t xml:space="preserve">Tu as trouvé un chemin que tu n'avais pas cherché. Qui marchait devant ?</w:t>
+      </w:r>
+    </w:p>
+    <w:p>
+      <w:pPr>
+        <w:spacing w:after="60"/>
+      </w:pPr>
+      <w:r>
+        <w:rPr>
+          <w:rFonts w:ascii="Cormorant Garamond" w:cs="Cormorant Garamond" w:eastAsia="Cormorant Garamond" w:hAnsi="Cormorant Garamond"/>
+          <w:sz w:val="22"/>
+          <w:szCs w:val="22"/>
+        </w:rPr>
+        <w:t xml:space="preserve">Al-Hādī — Le Guide</w:t>
       </w:r>
     </w:p>
     <w:p>
@@ -9247,7 +9455,20 @@
           <w:sz w:val="22"/>
           <w:szCs w:val="22"/>
         </w:rPr>
-        <w:t xml:space="preserve">Aucune fleur ne ressemble à une autre. Qui invente sans se répéter ?\n\nAl-Badī' — L'Inventeur</w:t>
+        <w:t xml:space="preserve">Aucune fleur ne ressemble à une autre. Qui invente sans se répéter ?</w:t>
+      </w:r>
+    </w:p>
+    <w:p>
+      <w:pPr>
+        <w:spacing w:after="60"/>
+      </w:pPr>
+      <w:r>
+        <w:rPr>
+          <w:rFonts w:ascii="Cormorant Garamond" w:cs="Cormorant Garamond" w:eastAsia="Cormorant Garamond" w:hAnsi="Cormorant Garamond"/>
+          <w:sz w:val="22"/>
+          <w:szCs w:val="22"/>
+        </w:rPr>
+        <w:t xml:space="preserve">Al-Badī' — L'Inventeur</w:t>
       </w:r>
     </w:p>
     <w:p>
@@ -9299,7 +9520,20 @@
           <w:sz w:val="22"/>
           <w:szCs w:val="22"/>
         </w:rPr>
-        <w:t xml:space="preserve">À qui revient tout ce que tu laisses derrière toi ?\n\nAl-Wārith — L'Héritier</w:t>
+        <w:t xml:space="preserve">À qui revient tout ce que tu laisses derrière toi ?</w:t>
+      </w:r>
+    </w:p>
+    <w:p>
+      <w:pPr>
+        <w:spacing w:after="60"/>
+      </w:pPr>
+      <w:r>
+        <w:rPr>
+          <w:rFonts w:ascii="Cormorant Garamond" w:cs="Cormorant Garamond" w:eastAsia="Cormorant Garamond" w:hAnsi="Cormorant Garamond"/>
+          <w:sz w:val="22"/>
+          <w:szCs w:val="22"/>
+        </w:rPr>
+        <w:t xml:space="preserve">Al-Wārith — L'Héritier</w:t>
       </w:r>
     </w:p>
     <w:p>

</xml_diff>